<commit_message>
Community 2-col + Trust → after Founders + similar fake stats
- styles.css: .community__grid 2-col centrate (max 540px ciascuno) per
  i 2 box rimasti (Match + Reward), niente più colonna vuota.
- index.html: Trust spostato da pos 8 a pos 11 (dopo Team, prima della
  CTA finale). Eyebrow rinumerati: Numbers 09→08, References 10→09,
  Founders 11→10, Trust 11. Ordine 01–12 lineare.
- script.js: "You might also love…" — fake stats deterministici da slug
  hash (seats 120-920, licked 28-240) al posto dei trattini.
- build_docx.py: numerazione capitoli allineata al sito.

Co-Authored-By: Claude Opus 4.7 (1M context) <noreply@anthropic.com>
</commit_message>
<xml_diff>
--- a/Nana_Site_Texts.docx
+++ b/Nana_Site_Texts.docx
@@ -689,7 +689,7 @@
           <w:b w:val="0"/>
           <w:i w:val="0"/>
         </w:rPr>
-        <w:t>02 · Mission</w:t>
+        <w:t>03 · Mission</w:t>
       </w:r>
     </w:p>
     <w:p>
@@ -766,7 +766,7 @@
           <w:b w:val="0"/>
           <w:i w:val="0"/>
         </w:rPr>
-        <w:t>03 · Vision</w:t>
+        <w:t>04 · Vision</w:t>
       </w:r>
     </w:p>
     <w:p>
@@ -843,7 +843,7 @@
           <w:b w:val="0"/>
           <w:i w:val="0"/>
         </w:rPr>
-        <w:t>04 · How it works</w:t>
+        <w:t>05 · How it works</w:t>
       </w:r>
     </w:p>
     <w:p>
@@ -1066,7 +1066,7 @@
           <w:b w:val="0"/>
           <w:i w:val="0"/>
         </w:rPr>
-        <w:t>05 · The community cookbook</w:t>
+        <w:t>06 · The community cookbook</w:t>
       </w:r>
     </w:p>
     <w:p>
@@ -1370,7 +1370,7 @@
           <w:b w:val="0"/>
           <w:i w:val="0"/>
         </w:rPr>
-        <w:t>06 · The community</w:t>
+        <w:t>07 · The community</w:t>
       </w:r>
     </w:p>
     <w:p>
@@ -1649,7 +1649,7 @@
           <w:b w:val="0"/>
           <w:i w:val="0"/>
         </w:rPr>
-        <w:t>07 · Our founders</w:t>
+        <w:t>10 · Our founders</w:t>
       </w:r>
     </w:p>
     <w:p>
@@ -1977,7 +1977,7 @@
           <w:b w:val="0"/>
           <w:i w:val="0"/>
         </w:rPr>
-        <w:t>08 · Why now</w:t>
+        <w:t>02 · Why now</w:t>
       </w:r>
     </w:p>
     <w:p>
@@ -2088,7 +2088,7 @@
           <w:b w:val="0"/>
           <w:i w:val="0"/>
         </w:rPr>
-        <w:t>09 · Trust</w:t>
+        <w:t>11 · Trust</w:t>
       </w:r>
     </w:p>
     <w:p>
@@ -2174,7 +2174,7 @@
           <w:b w:val="0"/>
           <w:i w:val="0"/>
         </w:rPr>
-        <w:t>10 · By the numbers</w:t>
+        <w:t>08 · By the numbers</w:t>
       </w:r>
     </w:p>
     <w:p>
@@ -2701,7 +2701,7 @@
           <w:b w:val="0"/>
           <w:i w:val="0"/>
         </w:rPr>
-        <w:t>11 · Classroom debrief</w:t>
+        <w:t>12 · Classroom debrief</w:t>
       </w:r>
     </w:p>
     <w:p>

</xml_diff>